<commit_message>
Add and update Document API output files
</commit_message>
<xml_diff>
--- a/Output/docapi-tables-delete-column-output.docx
+++ b/Output/docapi-tables-delete-column-output.docx
@@ -19,7 +19,11 @@
               <w:right w:val="single" w:color="auto" w:sz="4" w:space="0"/>
             </w:tcBorders>
           </w:tcPr>
-          <w:p/>
+          <w:p>
+            <w:r>
+              <w:t>Banana</w:t>
+            </w:r>
+          </w:p>
         </w:tc>
         <w:tc>
           <w:tcPr>
@@ -31,7 +35,11 @@
               <w:right w:val="single" w:color="auto" w:sz="4" w:space="0"/>
             </w:tcBorders>
           </w:tcPr>
-          <w:p/>
+          <w:p>
+            <w:r>
+              <w:t>Mango</w:t>
+            </w:r>
+          </w:p>
         </w:tc>
       </w:tr>
       <w:tr>
@@ -45,7 +53,11 @@
               <w:right w:val="single" w:color="auto" w:sz="4" w:space="0"/>
             </w:tcBorders>
           </w:tcPr>
-          <w:p/>
+          <w:p>
+            <w:r>
+              <w:t>Grape</w:t>
+            </w:r>
+          </w:p>
         </w:tc>
         <w:tc>
           <w:tcPr>
@@ -57,7 +69,11 @@
               <w:right w:val="single" w:color="auto" w:sz="4" w:space="0"/>
             </w:tcBorders>
           </w:tcPr>
-          <w:p/>
+          <w:p>
+            <w:r>
+              <w:t>Kiwi</w:t>
+            </w:r>
+          </w:p>
         </w:tc>
       </w:tr>
       <w:tr>
@@ -71,7 +87,11 @@
               <w:right w:val="single" w:color="auto" w:sz="4" w:space="0"/>
             </w:tcBorders>
           </w:tcPr>
-          <w:p/>
+          <w:p>
+            <w:r>
+              <w:t>Pear</w:t>
+            </w:r>
+          </w:p>
         </w:tc>
         <w:tc>
           <w:tcPr>
@@ -83,7 +103,11 @@
               <w:right w:val="single" w:color="auto" w:sz="4" w:space="0"/>
             </w:tcBorders>
           </w:tcPr>
-          <w:p/>
+          <w:p>
+            <w:r>
+              <w:t>Peach</w:t>
+            </w:r>
+          </w:p>
         </w:tc>
       </w:tr>
     </w:tbl>

</xml_diff>